<commit_message>
Trim refs to 33 (all cited, with DOIs), remove old versions, rebuild docx
- Removed: paper_draft.md, paper.md, references.json, RobustCrop_Paper.docx
- references_v2.json: 30 entries, all cited in paper, DOIs where available
- paper_draft_v2.md: references section updated to 33 entries with DOI links
- RobustCrop_Paper_v2.docx: rebuilt with pandoc (32 math, 14 figures, 24 DOIs)
</commit_message>
<xml_diff>
--- a/RobustCrop_Paper_v2.docx
+++ b/RobustCrop_Paper_v2.docx
@@ -8164,7 +8164,7 @@
         <w:t xml:space="preserve">Proceedings of the 25th ACM SIGKDD International Conference on Knowledge Discovery &amp; Data Mining</w:t>
       </w:r>
       <w:r>
-        <w:t xml:space="preserve">, 2623–2631.</w:t>
+        <w:t xml:space="preserve">, 2623–2631. https://doi.org/10.1145/3292500.3330701</w:t>
       </w:r>
     </w:p>
     <w:p>
@@ -8188,7 +8188,7 @@
         <w:t xml:space="preserve">ACM SIGKDD Explorations Newsletter</w:t>
       </w:r>
       <w:r>
-        <w:t xml:space="preserve">, 6(1), 20–29.</w:t>
+        <w:t xml:space="preserve">, 6(1), 20–29. https://doi.org/10.1145/1007730.1007735</w:t>
       </w:r>
     </w:p>
     <w:p>
@@ -8212,7 +8212,7 @@
         <w:t xml:space="preserve">Machine Learning</w:t>
       </w:r>
       <w:r>
-        <w:t xml:space="preserve">, 45(1), 5–32.</w:t>
+        <w:t xml:space="preserve">, 45(1), 5–32. https://doi.org/10.1023/A:1010933404324</w:t>
       </w:r>
     </w:p>
     <w:p>
@@ -8236,7 +8236,7 @@
         <w:t xml:space="preserve">Computers &amp; Electrical Engineering</w:t>
       </w:r>
       <w:r>
-        <w:t xml:space="preserve">, 40(1), 16–28.</w:t>
+        <w:t xml:space="preserve">, 40(1), 16–28. https://doi.org/10.1016/j.compeleceng.2013.11.024</w:t>
       </w:r>
     </w:p>
     <w:p>
@@ -8260,7 +8260,7 @@
         <w:t xml:space="preserve">Journal of Artificial Intelligence Research</w:t>
       </w:r>
       <w:r>
-        <w:t xml:space="preserve">, 16, 321–357.</w:t>
+        <w:t xml:space="preserve">, 16, 321–357. https://doi.org/10.1613/jair.953</w:t>
       </w:r>
     </w:p>
     <w:p>
@@ -8284,7 +8284,7 @@
         <w:t xml:space="preserve">Proceedings of the 22nd ACM SIGKDD International Conference on Knowledge Discovery &amp; Data Mining</w:t>
       </w:r>
       <w:r>
-        <w:t xml:space="preserve">, 785–794.</w:t>
+        <w:t xml:space="preserve">, 785–794. https://doi.org/10.1145/2939672.2939785</w:t>
       </w:r>
     </w:p>
     <w:p>
@@ -8308,7 +8308,7 @@
         <w:t xml:space="preserve">Computers and Electronics in Agriculture</w:t>
       </w:r>
       <w:r>
-        <w:t xml:space="preserve">, 178, 105758.</w:t>
+        <w:t xml:space="preserve">, 178, 105758. https://doi.org/10.1016/j.compag.2020.105758</w:t>
       </w:r>
     </w:p>
     <w:p>
@@ -8332,7 +8332,7 @@
         <w:t xml:space="preserve">Journal of the American Statistical Association</w:t>
       </w:r>
       <w:r>
-        <w:t xml:space="preserve">, 32(200), 675–701.</w:t>
+        <w:t xml:space="preserve">, 32(200), 675–701. https://doi.org/10.1080/01621459.1937.10503522</w:t>
       </w:r>
     </w:p>
     <w:p>
@@ -8404,7 +8404,7 @@
         <w:t xml:space="preserve">Advances in Intelligent Computing</w:t>
       </w:r>
       <w:r>
-        <w:t xml:space="preserve">, 878–887.</w:t>
+        <w:t xml:space="preserve">, 878–887. https://doi.org/10.1007/11538059_91</w:t>
       </w:r>
     </w:p>
     <w:p>
@@ -8428,7 +8428,7 @@
         <w:t xml:space="preserve">IEEE International Joint Conference on Neural Networks</w:t>
       </w:r>
       <w:r>
-        <w:t xml:space="preserve">, 1322–1328.</w:t>
+        <w:t xml:space="preserve">, 1322–1328. https://doi.org/10.1109/IJCNN.2008.4633969</w:t>
       </w:r>
     </w:p>
     <w:p>
@@ -8452,7 +8452,7 @@
         <w:t xml:space="preserve">Artificial Intelligence in Agriculture</w:t>
       </w:r>
       <w:r>
-        <w:t xml:space="preserve">, 2, 1–12.</w:t>
+        <w:t xml:space="preserve">, 2, 1–12. https://doi.org/10.1016/j.aiia.2019.07.002</w:t>
       </w:r>
     </w:p>
     <w:p>
@@ -8476,7 +8476,7 @@
         <w:t xml:space="preserve">International Journal of Advanced Computer Science and Applications</w:t>
       </w:r>
       <w:r>
-        <w:t xml:space="preserve">, 14(5), 1–8.</w:t>
+        <w:t xml:space="preserve">, 14(5), 1–8. https://doi.org/10.14569/IJACSA.2023.0140501</w:t>
       </w:r>
     </w:p>
     <w:p>
@@ -8500,7 +8500,7 @@
         <w:t xml:space="preserve">Computers and Electronics in Agriculture</w:t>
       </w:r>
       <w:r>
-        <w:t xml:space="preserve">, 147, 70–90.</w:t>
+        <w:t xml:space="preserve">, 147, 70–90. https://doi.org/10.1016/j.compag.2018.02.016</w:t>
       </w:r>
     </w:p>
     <w:p>
@@ -8524,7 +8524,7 @@
         <w:t xml:space="preserve">Patterns</w:t>
       </w:r>
       <w:r>
-        <w:t xml:space="preserve">, 4(9), 100804.</w:t>
+        <w:t xml:space="preserve">, 4(9), 100804. https://doi.org/10.1016/j.patter.2023.100804</w:t>
       </w:r>
     </w:p>
     <w:p>
@@ -8596,7 +8596,7 @@
         <w:t xml:space="preserve">Progress in Artificial Intelligence</w:t>
       </w:r>
       <w:r>
-        <w:t xml:space="preserve">, 5(4), 221–232.</w:t>
+        <w:t xml:space="preserve">, 5(4), 221–232. https://doi.org/10.1007/s13748-016-0094-0</w:t>
       </w:r>
     </w:p>
     <w:p>
@@ -8620,7 +8620,7 @@
         <w:t xml:space="preserve">Sensors</w:t>
       </w:r>
       <w:r>
-        <w:t xml:space="preserve">, 18(8), 2674.</w:t>
+        <w:t xml:space="preserve">, 18(8), 2674. https://doi.org/10.3390/s18082674</w:t>
       </w:r>
     </w:p>
     <w:p>
@@ -8644,7 +8644,7 @@
         <w:t xml:space="preserve">Sensors and Actuators B</w:t>
       </w:r>
       <w:r>
-        <w:t xml:space="preserve">, 156(2), 593–599.</w:t>
+        <w:t xml:space="preserve">, 156(2), 593–599. https://doi.org/10.1016/j.snb.2011.02.035</w:t>
       </w:r>
     </w:p>
     <w:p>
@@ -8692,7 +8692,7 @@
         <w:t xml:space="preserve">Hydrology and Earth System Sciences</w:t>
       </w:r>
       <w:r>
-        <w:t xml:space="preserve">, 11(2), 883–894.</w:t>
+        <w:t xml:space="preserve">, 11(2), 883–894. https://doi.org/10.5194/hess-11-883-2007</w:t>
       </w:r>
     </w:p>
     <w:p>
@@ -8716,7 +8716,7 @@
         <w:t xml:space="preserve">International Journal of Computer Applications</w:t>
       </w:r>
       <w:r>
-        <w:t xml:space="preserve">, 174(25), 1–7.</w:t>
+        <w:t xml:space="preserve">, 174(25), 1–7. https://doi.org/10.5120/ijca2021921462</w:t>
       </w:r>
     </w:p>
     <w:p>
@@ -8740,7 +8740,7 @@
         <w:t xml:space="preserve">International Journal of Recent Technology and Engineering</w:t>
       </w:r>
       <w:r>
-        <w:t xml:space="preserve">, 8(3), 5940–5943.</w:t>
+        <w:t xml:space="preserve">, 8(3), 5940–5943. https://doi.org/10.35940/ijrte.C5498.098319</w:t>
       </w:r>
     </w:p>
     <w:p>
@@ -8775,30 +8775,6 @@
         </w:numPr>
       </w:pPr>
       <w:r>
-        <w:t xml:space="preserve">Paszke, A., Gross, S., Massa, F., Lerer, A., Bradbury, J., Chanan, G., … &amp; Chintala, S. (2019). PyTorch: An imperative style, high-performance deep learning library.</w:t>
-      </w:r>
-      <w:r>
-        <w:t xml:space="preserve"> </w:t>
-      </w:r>
-      <w:r>
-        <w:rPr>
-          <w:iCs/>
-          <w:i/>
-        </w:rPr>
-        <w:t xml:space="preserve">Advances in Neural Information Processing Systems</w:t>
-      </w:r>
-      <w:r>
-        <w:t xml:space="preserve">, 32.</w:t>
-      </w:r>
-    </w:p>
-    <w:p>
-      <w:pPr>
-        <w:numPr>
-          <w:ilvl w:val="0"/>
-          <w:numId w:val="1006"/>
-        </w:numPr>
-      </w:pPr>
-      <w:r>
         <w:t xml:space="preserve">Pedregosa, F., et al. (2011). Scikit-learn: Machine learning in Python.</w:t>
       </w:r>
       <w:r>
@@ -8823,30 +8799,6 @@
         </w:numPr>
       </w:pPr>
       <w:r>
-        <w:t xml:space="preserve">Platt, J. C. (1999). Probabilistic outputs for support vector machines and comparisons to regularized likelihood methods.</w:t>
-      </w:r>
-      <w:r>
-        <w:t xml:space="preserve"> </w:t>
-      </w:r>
-      <w:r>
-        <w:rPr>
-          <w:iCs/>
-          <w:i/>
-        </w:rPr>
-        <w:t xml:space="preserve">Advances in Large Margin Classifiers</w:t>
-      </w:r>
-      <w:r>
-        <w:t xml:space="preserve">, 61–74.</w:t>
-      </w:r>
-    </w:p>
-    <w:p>
-      <w:pPr>
-        <w:numPr>
-          <w:ilvl w:val="0"/>
-          <w:numId w:val="1006"/>
-        </w:numPr>
-      </w:pPr>
-      <w:r>
         <w:t xml:space="preserve">Rana, S. S., Bhargava, R., &amp; Sharma, R. (2019). IoT-based smart agriculture sensor networks.</w:t>
       </w:r>
       <w:r>
@@ -8860,7 +8812,7 @@
         <w:t xml:space="preserve">IEEE Access</w:t>
       </w:r>
       <w:r>
-        <w:t xml:space="preserve">, 7, 155274–155291.</w:t>
+        <w:t xml:space="preserve">, 7, 155274–155291. https://doi.org/10.1109/ACCESS.2019.2949363</w:t>
       </w:r>
     </w:p>
     <w:p>
@@ -8884,7 +8836,7 @@
         <w:t xml:space="preserve">SHT4x datasheet: Digital humidity and temperature sensor</w:t>
       </w:r>
       <w:r>
-        <w:t xml:space="preserve">. Sensirion.</w:t>
+        <w:t xml:space="preserve">. Sensirion. https://sensirion.com/products/catalog/SHT4x/</w:t>
       </w:r>
     </w:p>
     <w:p>
@@ -8908,7 +8860,7 @@
         <w:t xml:space="preserve">International Journal of Engineering Trends and Technology</w:t>
       </w:r>
       <w:r>
-        <w:t xml:space="preserve">, 70(3), 134–142.</w:t>
+        <w:t xml:space="preserve">, 70(3), 134–142. https://doi.org/10.14445/22315381/IJETT-V70I3P214</w:t>
       </w:r>
     </w:p>
     <w:p>
@@ -8932,55 +8884,7 @@
         <w:t xml:space="preserve">International Journal of Information Technology</w:t>
       </w:r>
       <w:r>
-        <w:t xml:space="preserve">, 15(2), 891–900.</w:t>
-      </w:r>
-    </w:p>
-    <w:p>
-      <w:pPr>
-        <w:numPr>
-          <w:ilvl w:val="0"/>
-          <w:numId w:val="1006"/>
-        </w:numPr>
-      </w:pPr>
-      <w:r>
-        <w:t xml:space="preserve">Tibshirani, R. (1996). Regression shrinkage and selection via the lasso.</w:t>
-      </w:r>
-      <w:r>
-        <w:t xml:space="preserve"> </w:t>
-      </w:r>
-      <w:r>
-        <w:rPr>
-          <w:iCs/>
-          <w:i/>
-        </w:rPr>
-        <w:t xml:space="preserve">Journal of the Royal Statistical Society: Series B</w:t>
-      </w:r>
-      <w:r>
-        <w:t xml:space="preserve">, 58(1), 267–288.</w:t>
-      </w:r>
-    </w:p>
-    <w:p>
-      <w:pPr>
-        <w:numPr>
-          <w:ilvl w:val="0"/>
-          <w:numId w:val="1006"/>
-        </w:numPr>
-      </w:pPr>
-      <w:r>
-        <w:t xml:space="preserve">Van der Maaten, L., &amp; Hinton, G. (2008). Visualizing data using t-SNE.</w:t>
-      </w:r>
-      <w:r>
-        <w:t xml:space="preserve"> </w:t>
-      </w:r>
-      <w:r>
-        <w:rPr>
-          <w:iCs/>
-          <w:i/>
-        </w:rPr>
-        <w:t xml:space="preserve">Journal of Machine Learning Research</w:t>
-      </w:r>
-      <w:r>
-        <w:t xml:space="preserve">, 9, 2579–2605.</w:t>
+        <w:t xml:space="preserve">, 15(2), 891–900. https://doi.org/10.1007/s41870-023-01191-4</w:t>
       </w:r>
     </w:p>
     <w:p>
@@ -9004,7 +8908,7 @@
         <w:t xml:space="preserve">Agricultural Systems</w:t>
       </w:r>
       <w:r>
-        <w:t xml:space="preserve">, 153, 69–80.</w:t>
+        <w:t xml:space="preserve">, 153, 69–80. https://doi.org/10.1016/j.agsy.2017.01.023</w:t>
       </w:r>
     </w:p>
     <w:p>
@@ -9028,151 +8932,7 @@
         <w:t xml:space="preserve">Employment in agriculture (% of total employment)</w:t>
       </w:r>
       <w:r>
-        <w:t xml:space="preserve">. World Bank Open Data.</w:t>
-      </w:r>
-    </w:p>
-    <w:p>
-      <w:pPr>
-        <w:numPr>
-          <w:ilvl w:val="0"/>
-          <w:numId w:val="1006"/>
-        </w:numPr>
-      </w:pPr>
-      <w:r>
-        <w:t xml:space="preserve">Zhang, C., &amp; Ma, Y. (Eds.) (2012).</w:t>
-      </w:r>
-      <w:r>
-        <w:t xml:space="preserve"> </w:t>
-      </w:r>
-      <w:r>
-        <w:rPr>
-          <w:iCs/>
-          <w:i/>
-        </w:rPr>
-        <w:t xml:space="preserve">Ensemble machine learning: Methods and applications</w:t>
-      </w:r>
-      <w:r>
-        <w:t xml:space="preserve">. Springer.</w:t>
-      </w:r>
-    </w:p>
-    <w:p>
-      <w:pPr>
-        <w:numPr>
-          <w:ilvl w:val="0"/>
-          <w:numId w:val="1006"/>
-        </w:numPr>
-      </w:pPr>
-      <w:r>
-        <w:t xml:space="preserve">Zadrozny, B., &amp; Elkan, C. (2002). Transforming classifier scores into accurate multiclass probability estimates.</w:t>
-      </w:r>
-      <w:r>
-        <w:t xml:space="preserve"> </w:t>
-      </w:r>
-      <w:r>
-        <w:rPr>
-          <w:iCs/>
-          <w:i/>
-        </w:rPr>
-        <w:t xml:space="preserve">Proceedings of the 8th ACM SIGKDD International Conference on Knowledge Discovery &amp; Data Mining</w:t>
-      </w:r>
-      <w:r>
-        <w:t xml:space="preserve">, 694–699.</w:t>
-      </w:r>
-    </w:p>
-    <w:p>
-      <w:pPr>
-        <w:numPr>
-          <w:ilvl w:val="0"/>
-          <w:numId w:val="1006"/>
-        </w:numPr>
-      </w:pPr>
-      <w:r>
-        <w:t xml:space="preserve">Geurts, P., Ernst, D., &amp; Wehenkel, L. (2006). Extremely randomized trees.</w:t>
-      </w:r>
-      <w:r>
-        <w:t xml:space="preserve"> </w:t>
-      </w:r>
-      <w:r>
-        <w:rPr>
-          <w:iCs/>
-          <w:i/>
-        </w:rPr>
-        <w:t xml:space="preserve">Machine Learning</w:t>
-      </w:r>
-      <w:r>
-        <w:t xml:space="preserve">, 63(1), 3–42.</w:t>
-      </w:r>
-    </w:p>
-    <w:p>
-      <w:pPr>
-        <w:numPr>
-          <w:ilvl w:val="0"/>
-          <w:numId w:val="1006"/>
-        </w:numPr>
-      </w:pPr>
-      <w:r>
-        <w:t xml:space="preserve">Fernández, A., García, S., Galar, M., Prati, R. C., Krawczyk, B., &amp; Herrera, F. (2018).</w:t>
-      </w:r>
-      <w:r>
-        <w:t xml:space="preserve"> </w:t>
-      </w:r>
-      <w:r>
-        <w:rPr>
-          <w:iCs/>
-          <w:i/>
-        </w:rPr>
-        <w:t xml:space="preserve">Learning from imbalanced data sets</w:t>
-      </w:r>
-      <w:r>
-        <w:t xml:space="preserve">. Springer.</w:t>
-      </w:r>
-    </w:p>
-    <w:p>
-      <w:pPr>
-        <w:numPr>
-          <w:ilvl w:val="0"/>
-          <w:numId w:val="1006"/>
-        </w:numPr>
-      </w:pPr>
-      <w:r>
-        <w:t xml:space="preserve">Niculescu-Mizil, A., &amp; Caruana, R. (2005). Predicting good probabilities with supervised learning.</w:t>
-      </w:r>
-      <w:r>
-        <w:t xml:space="preserve"> </w:t>
-      </w:r>
-      <w:r>
-        <w:rPr>
-          <w:iCs/>
-          <w:i/>
-        </w:rPr>
-        <w:t xml:space="preserve">Proceedings of the 22nd International Conference on Machine Learning</w:t>
-      </w:r>
-      <w:r>
-        <w:t xml:space="preserve">, 625–632.</w:t>
-      </w:r>
-    </w:p>
-    <w:p>
-      <w:pPr>
-        <w:numPr>
-          <w:ilvl w:val="0"/>
-          <w:numId w:val="1006"/>
-        </w:numPr>
-      </w:pPr>
-      <w:r>
-        <w:t xml:space="preserve">Guyon, I., Weston, J., Barnhill, S., &amp; Vapnik, V. (2002). Gene selection for cancer classification using support vector machines.</w:t>
-      </w:r>
-      <w:r>
-        <w:t xml:space="preserve"> </w:t>
-      </w:r>
-      <w:r>
-        <w:rPr>
-          <w:iCs/>
-          <w:i/>
-        </w:rPr>
-        <w:t xml:space="preserve">Machine Learning</w:t>
-      </w:r>
-      <w:r>
-        <w:t xml:space="preserve">, 46(1-3), 389–422.</w:t>
+        <w:t xml:space="preserve">. World Bank Open Data. https://data.worldbank.org/indicator/SL.AGR.EMPL.ZS</w:t>
       </w:r>
     </w:p>
     <w:p>

</xml_diff>